<commit_message>
TS 4.3 Kramam Jatai compare
</commit_message>
<xml_diff>
--- a/TS-Kramam/TS-4.3/TS 4.3 Tamil Krama Paatam Corrections.docx
+++ b/TS-Kramam/TS-4.3/TS 4.3 Tamil Krama Paatam Corrections.docx
@@ -866,6 +866,581 @@
           </w:p>
         </w:tc>
       </w:tr>
+      <w:tr>
+        <w:trPr>
+          <w:trHeight w:val="1118"/>
+        </w:trPr>
+        <w:tc>
+          <w:tcPr>
+            <w:tcW w:w="3906" w:type="dxa"/>
+            <w:tcBorders>
+              <w:top w:val="single" w:sz="4" w:space="0" w:color="000000"/>
+              <w:left w:val="single" w:sz="4" w:space="0" w:color="000000"/>
+              <w:bottom w:val="single" w:sz="4" w:space="0" w:color="000000"/>
+              <w:right w:val="single" w:sz="4" w:space="0" w:color="000000"/>
+            </w:tcBorders>
+          </w:tcPr>
+          <w:p>
+            <w:pPr>
+              <w:widowControl w:val="0"/>
+              <w:tabs>
+                <w:tab w:val="left" w:pos="993"/>
+              </w:tabs>
+              <w:autoSpaceDE w:val="0"/>
+              <w:autoSpaceDN w:val="0"/>
+              <w:adjustRightInd w:val="0"/>
+              <w:spacing w:before="0" w:line="240" w:lineRule="auto"/>
+              <w:ind w:right="297"/>
+              <w:rPr>
+                <w:rFonts w:cs="Arial"/>
+                <w:b/>
+                <w:sz w:val="28"/>
+                <w:szCs w:val="32"/>
+              </w:rPr>
+            </w:pPr>
+            <w:r>
+              <w:rPr>
+                <w:rFonts w:cs="Arial"/>
+                <w:b/>
+                <w:sz w:val="28"/>
+                <w:szCs w:val="32"/>
+              </w:rPr>
+              <w:t>T.S.4.3.</w:t>
+            </w:r>
+            <w:r>
+              <w:rPr>
+                <w:rFonts w:cs="Arial"/>
+                <w:b/>
+                <w:sz w:val="28"/>
+                <w:szCs w:val="32"/>
+              </w:rPr>
+              <w:t>11.5</w:t>
+            </w:r>
+            <w:r>
+              <w:rPr>
+                <w:rFonts w:cs="Arial"/>
+                <w:b/>
+                <w:sz w:val="28"/>
+                <w:szCs w:val="32"/>
+              </w:rPr>
+              <w:t xml:space="preserve"> – Kramam</w:t>
+            </w:r>
+          </w:p>
+          <w:p>
+            <w:pPr>
+              <w:widowControl w:val="0"/>
+              <w:tabs>
+                <w:tab w:val="left" w:pos="993"/>
+              </w:tabs>
+              <w:autoSpaceDE w:val="0"/>
+              <w:autoSpaceDN w:val="0"/>
+              <w:adjustRightInd w:val="0"/>
+              <w:spacing w:before="0" w:line="240" w:lineRule="auto"/>
+              <w:ind w:right="297"/>
+              <w:rPr>
+                <w:rFonts w:cs="Arial"/>
+                <w:b/>
+                <w:sz w:val="28"/>
+                <w:szCs w:val="32"/>
+                <w:lang w:val="en-IN"/>
+              </w:rPr>
+            </w:pPr>
+            <w:r>
+              <w:rPr>
+                <w:rFonts w:cs="Arial"/>
+                <w:b/>
+                <w:sz w:val="28"/>
+                <w:szCs w:val="32"/>
+                <w:lang w:val="en-IN"/>
+              </w:rPr>
+              <w:t>Krama Vaakyam No.– 31</w:t>
+            </w:r>
+          </w:p>
+          <w:p>
+            <w:pPr>
+              <w:widowControl w:val="0"/>
+              <w:tabs>
+                <w:tab w:val="left" w:pos="993"/>
+              </w:tabs>
+              <w:autoSpaceDE w:val="0"/>
+              <w:autoSpaceDN w:val="0"/>
+              <w:adjustRightInd w:val="0"/>
+              <w:spacing w:before="0" w:line="252" w:lineRule="auto"/>
+              <w:ind w:right="297"/>
+              <w:rPr>
+                <w:rFonts w:cs="Arial"/>
+                <w:b/>
+                <w:sz w:val="28"/>
+                <w:szCs w:val="32"/>
+              </w:rPr>
+            </w:pPr>
+            <w:r>
+              <w:rPr>
+                <w:rFonts w:cs="Arial"/>
+                <w:b/>
+                <w:sz w:val="28"/>
+                <w:szCs w:val="32"/>
+                <w:lang w:val="it-IT"/>
+              </w:rPr>
+              <w:t>Panchaati No</w:t>
+            </w:r>
+            <w:r>
+              <w:rPr>
+                <w:rFonts w:cs="Arial"/>
+                <w:b/>
+                <w:szCs w:val="32"/>
+                <w:lang w:val="it-IT"/>
+              </w:rPr>
+              <w:t xml:space="preserve">. - </w:t>
+            </w:r>
+            <w:r>
+              <w:rPr>
+                <w:rFonts w:cs="Arial"/>
+                <w:b/>
+                <w:sz w:val="28"/>
+                <w:szCs w:val="32"/>
+                <w:lang w:val="it-IT"/>
+              </w:rPr>
+              <w:t>25</w:t>
+            </w:r>
+          </w:p>
+        </w:tc>
+        <w:tc>
+          <w:tcPr>
+            <w:tcW w:w="5103" w:type="dxa"/>
+            <w:tcBorders>
+              <w:top w:val="single" w:sz="4" w:space="0" w:color="000000"/>
+              <w:left w:val="single" w:sz="4" w:space="0" w:color="000000"/>
+              <w:bottom w:val="single" w:sz="4" w:space="0" w:color="000000"/>
+              <w:right w:val="single" w:sz="4" w:space="0" w:color="000000"/>
+            </w:tcBorders>
+          </w:tcPr>
+          <w:p>
+            <w:pPr>
+              <w:widowControl w:val="0"/>
+              <w:autoSpaceDE w:val="0"/>
+              <w:autoSpaceDN w:val="0"/>
+              <w:adjustRightInd w:val="0"/>
+              <w:spacing w:before="0" w:line="240" w:lineRule="auto"/>
+              <w:rPr>
+                <w:rFonts w:ascii="Latha" w:hAnsi="Latha" w:cs="Latha"/>
+                <w:sz w:val="28"/>
+                <w:szCs w:val="28"/>
+                <w:lang w:bidi="ta-IN"/>
+              </w:rPr>
+            </w:pPr>
+            <w:r>
+              <w:rPr>
+                <w:rFonts w:ascii="Latha" w:hAnsi="Latha" w:cs="Latha"/>
+                <w:sz w:val="28"/>
+                <w:szCs w:val="28"/>
+                <w:cs/>
+                <w:lang w:bidi="ta-IN"/>
+              </w:rPr>
+              <w:t>ந</w:t>
+            </w:r>
+            <w:r>
+              <w:rPr>
+                <w:rFonts w:ascii="BRH Tamil Tab Extra" w:hAnsi="BRH Tamil Tab Extra" w:cs="Latha"/>
+                <w:b/>
+                <w:sz w:val="36"/>
+                <w:szCs w:val="28"/>
+                <w:lang w:bidi="ta-IN"/>
+              </w:rPr>
+              <w:t>…</w:t>
+            </w:r>
+            <w:r>
+              <w:rPr>
+                <w:rFonts w:ascii="Latha" w:hAnsi="Latha" w:cs="Latha"/>
+                <w:b/>
+                <w:bCs/>
+                <w:sz w:val="32"/>
+                <w:szCs w:val="32"/>
+                <w:cs/>
+                <w:lang w:bidi="ta-IN"/>
+              </w:rPr>
+              <w:t>:</w:t>
+            </w:r>
+            <w:r>
+              <w:rPr>
+                <w:rFonts w:ascii="Latha" w:hAnsi="Latha" w:cs="Latha"/>
+                <w:sz w:val="28"/>
+                <w:szCs w:val="28"/>
+                <w:lang w:bidi="ta-IN"/>
+              </w:rPr>
+              <w:t xml:space="preserve"> </w:t>
+            </w:r>
+            <w:r>
+              <w:rPr>
+                <w:rFonts w:ascii="Latha" w:hAnsi="Latha" w:cs="Latha"/>
+                <w:sz w:val="28"/>
+                <w:szCs w:val="28"/>
+                <w:cs/>
+                <w:lang w:bidi="ta-IN"/>
+              </w:rPr>
+              <w:t>பய</w:t>
+            </w:r>
+            <w:r>
+              <w:rPr>
+                <w:rFonts w:ascii="BRH Tamil Tab Extra" w:hAnsi="BRH Tamil Tab Extra" w:cs="Latha"/>
+                <w:b/>
+                <w:sz w:val="36"/>
+                <w:szCs w:val="28"/>
+                <w:lang w:bidi="ta-IN"/>
+              </w:rPr>
+              <w:t>†</w:t>
+            </w:r>
+            <w:r>
+              <w:rPr>
+                <w:rFonts w:ascii="Latha" w:hAnsi="Latha" w:cs="Latha"/>
+                <w:sz w:val="28"/>
+                <w:szCs w:val="28"/>
+                <w:cs/>
+                <w:lang w:bidi="ta-IN"/>
+              </w:rPr>
+              <w:t>ஸ்வதீ</w:t>
+            </w:r>
+            <w:r>
+              <w:rPr>
+                <w:rFonts w:ascii="Latha" w:hAnsi="Latha" w:cs="Latha"/>
+                <w:sz w:val="28"/>
+                <w:szCs w:val="28"/>
+                <w:lang w:bidi="ta-IN"/>
+              </w:rPr>
+              <w:t xml:space="preserve"> | </w:t>
+            </w:r>
+            <w:r>
+              <w:rPr>
+                <w:rFonts w:ascii="Latha" w:hAnsi="Latha" w:cs="Latha"/>
+                <w:sz w:val="28"/>
+                <w:szCs w:val="28"/>
+                <w:lang w:bidi="ta-IN"/>
+              </w:rPr>
+              <w:br/>
+            </w:r>
+            <w:r>
+              <w:rPr>
+                <w:rFonts w:ascii="Latha" w:hAnsi="Latha" w:cs="Latha"/>
+                <w:sz w:val="28"/>
+                <w:szCs w:val="28"/>
+                <w:cs/>
+                <w:lang w:bidi="ta-IN"/>
+              </w:rPr>
+              <w:t>பய</w:t>
+            </w:r>
+            <w:r>
+              <w:rPr>
+                <w:rFonts w:ascii="BRH Tamil Tab Extra" w:hAnsi="BRH Tamil Tab Extra" w:cs="Latha"/>
+                <w:b/>
+                <w:sz w:val="36"/>
+                <w:szCs w:val="28"/>
+                <w:lang w:bidi="ta-IN"/>
+              </w:rPr>
+              <w:t>†</w:t>
+            </w:r>
+            <w:r>
+              <w:rPr>
+                <w:rFonts w:ascii="Latha" w:hAnsi="Latha" w:cs="Latha"/>
+                <w:sz w:val="28"/>
+                <w:szCs w:val="28"/>
+                <w:cs/>
+                <w:lang w:bidi="ta-IN"/>
+              </w:rPr>
+              <w:t>ஸ்வதீ</w:t>
+            </w:r>
+            <w:r>
+              <w:rPr>
+                <w:rFonts w:ascii="Latha" w:hAnsi="Latha" w:cs="Latha"/>
+                <w:sz w:val="28"/>
+                <w:szCs w:val="28"/>
+                <w:lang w:bidi="ta-IN"/>
+              </w:rPr>
+              <w:t xml:space="preserve"> </w:t>
+            </w:r>
+            <w:r>
+              <w:rPr>
+                <w:rFonts w:ascii="Latha" w:hAnsi="Latha" w:cs="Latha"/>
+                <w:sz w:val="28"/>
+                <w:szCs w:val="28"/>
+                <w:highlight w:val="yellow"/>
+                <w:cs/>
+                <w:lang w:bidi="ta-IN"/>
+              </w:rPr>
+              <w:t>து</w:t>
+            </w:r>
+            <w:r>
+              <w:rPr>
+                <w:rFonts w:ascii="BRH Tamil Tab Extra" w:hAnsi="BRH Tamil Tab Extra" w:cs="Latha"/>
+                <w:b/>
+                <w:sz w:val="36"/>
+                <w:szCs w:val="28"/>
+                <w:highlight w:val="yellow"/>
+                <w:lang w:bidi="ta-IN"/>
+              </w:rPr>
+              <w:t>…</w:t>
+            </w:r>
+            <w:r>
+              <w:rPr>
+                <w:rFonts w:ascii="Latha" w:hAnsi="Latha" w:cs="Latha"/>
+                <w:b/>
+                <w:bCs/>
+                <w:position w:val="-12"/>
+                <w:sz w:val="28"/>
+                <w:szCs w:val="28"/>
+                <w:highlight w:val="yellow"/>
+                <w:cs/>
+                <w:lang w:bidi="ta-IN"/>
+              </w:rPr>
+              <w:t>4</w:t>
+            </w:r>
+            <w:r>
+              <w:rPr>
+                <w:rFonts w:ascii="Latha" w:hAnsi="Latha" w:cs="Latha"/>
+                <w:sz w:val="28"/>
+                <w:szCs w:val="28"/>
+                <w:cs/>
+                <w:lang w:bidi="ta-IN"/>
+              </w:rPr>
+              <w:t>க்ஷ்வ</w:t>
+            </w:r>
+            <w:r>
+              <w:rPr>
+                <w:rFonts w:ascii="Latha" w:hAnsi="Latha" w:cs="Latha"/>
+                <w:sz w:val="28"/>
+                <w:szCs w:val="28"/>
+                <w:lang w:bidi="ta-IN"/>
+              </w:rPr>
+              <w:t xml:space="preserve"> |</w:t>
+            </w:r>
+          </w:p>
+          <w:p>
+            <w:pPr>
+              <w:widowControl w:val="0"/>
+              <w:autoSpaceDE w:val="0"/>
+              <w:autoSpaceDN w:val="0"/>
+              <w:adjustRightInd w:val="0"/>
+              <w:spacing w:before="0" w:line="240" w:lineRule="auto"/>
+              <w:rPr>
+                <w:rFonts w:ascii="Latha" w:hAnsi="Latha" w:cs="Latha"/>
+                <w:sz w:val="28"/>
+                <w:szCs w:val="28"/>
+                <w:cs/>
+                <w:lang w:bidi="ta-IN"/>
+              </w:rPr>
+            </w:pPr>
+          </w:p>
+        </w:tc>
+        <w:tc>
+          <w:tcPr>
+            <w:tcW w:w="5386" w:type="dxa"/>
+            <w:tcBorders>
+              <w:top w:val="single" w:sz="4" w:space="0" w:color="000000"/>
+              <w:left w:val="single" w:sz="4" w:space="0" w:color="000000"/>
+              <w:bottom w:val="single" w:sz="4" w:space="0" w:color="000000"/>
+              <w:right w:val="single" w:sz="4" w:space="0" w:color="000000"/>
+            </w:tcBorders>
+          </w:tcPr>
+          <w:p>
+            <w:pPr>
+              <w:widowControl w:val="0"/>
+              <w:autoSpaceDE w:val="0"/>
+              <w:autoSpaceDN w:val="0"/>
+              <w:adjustRightInd w:val="0"/>
+              <w:spacing w:before="0" w:line="240" w:lineRule="auto"/>
+              <w:rPr>
+                <w:rFonts w:ascii="Latha" w:hAnsi="Latha" w:cs="Latha"/>
+                <w:sz w:val="28"/>
+                <w:szCs w:val="28"/>
+                <w:highlight w:val="green"/>
+                <w:cs/>
+                <w:lang w:bidi="ta-IN"/>
+              </w:rPr>
+            </w:pPr>
+            <w:r>
+              <w:rPr>
+                <w:rFonts w:ascii="Latha" w:hAnsi="Latha" w:cs="Latha"/>
+                <w:sz w:val="28"/>
+                <w:szCs w:val="28"/>
+                <w:cs/>
+                <w:lang w:bidi="ta-IN"/>
+              </w:rPr>
+              <w:t>ந</w:t>
+            </w:r>
+            <w:r>
+              <w:rPr>
+                <w:rFonts w:ascii="BRH Tamil Tab Extra" w:hAnsi="BRH Tamil Tab Extra" w:cs="Latha"/>
+                <w:b/>
+                <w:sz w:val="36"/>
+                <w:szCs w:val="28"/>
+                <w:lang w:bidi="ta-IN"/>
+              </w:rPr>
+              <w:t>…</w:t>
+            </w:r>
+            <w:r>
+              <w:rPr>
+                <w:rFonts w:ascii="Latha" w:hAnsi="Latha" w:cs="Latha"/>
+                <w:b/>
+                <w:bCs/>
+                <w:sz w:val="32"/>
+                <w:szCs w:val="32"/>
+                <w:cs/>
+                <w:lang w:bidi="ta-IN"/>
+              </w:rPr>
+              <w:t>:</w:t>
+            </w:r>
+            <w:r>
+              <w:rPr>
+                <w:rFonts w:ascii="Latha" w:hAnsi="Latha" w:cs="Latha"/>
+                <w:sz w:val="28"/>
+                <w:szCs w:val="28"/>
+                <w:lang w:bidi="ta-IN"/>
+              </w:rPr>
+              <w:t xml:space="preserve"> </w:t>
+            </w:r>
+            <w:r>
+              <w:rPr>
+                <w:rFonts w:ascii="Latha" w:hAnsi="Latha" w:cs="Latha"/>
+                <w:sz w:val="28"/>
+                <w:szCs w:val="28"/>
+                <w:cs/>
+                <w:lang w:bidi="ta-IN"/>
+              </w:rPr>
+              <w:t>பய</w:t>
+            </w:r>
+            <w:r>
+              <w:rPr>
+                <w:rFonts w:ascii="BRH Tamil Tab Extra" w:hAnsi="BRH Tamil Tab Extra" w:cs="Latha"/>
+                <w:b/>
+                <w:sz w:val="36"/>
+                <w:szCs w:val="28"/>
+                <w:lang w:bidi="ta-IN"/>
+              </w:rPr>
+              <w:t>†</w:t>
+            </w:r>
+            <w:r>
+              <w:rPr>
+                <w:rFonts w:ascii="Latha" w:hAnsi="Latha" w:cs="Latha"/>
+                <w:sz w:val="28"/>
+                <w:szCs w:val="28"/>
+                <w:cs/>
+                <w:lang w:bidi="ta-IN"/>
+              </w:rPr>
+              <w:t>ஸ்வதீ</w:t>
+            </w:r>
+            <w:r>
+              <w:rPr>
+                <w:rFonts w:ascii="Latha" w:hAnsi="Latha" w:cs="Latha"/>
+                <w:sz w:val="28"/>
+                <w:szCs w:val="28"/>
+                <w:lang w:bidi="ta-IN"/>
+              </w:rPr>
+              <w:t xml:space="preserve"> | </w:t>
+            </w:r>
+            <w:r>
+              <w:rPr>
+                <w:rFonts w:ascii="Latha" w:hAnsi="Latha" w:cs="Latha"/>
+                <w:sz w:val="28"/>
+                <w:szCs w:val="28"/>
+                <w:lang w:bidi="ta-IN"/>
+              </w:rPr>
+              <w:br/>
+            </w:r>
+            <w:r>
+              <w:rPr>
+                <w:rFonts w:ascii="Latha" w:hAnsi="Latha" w:cs="Latha"/>
+                <w:sz w:val="28"/>
+                <w:szCs w:val="28"/>
+                <w:cs/>
+                <w:lang w:bidi="ta-IN"/>
+              </w:rPr>
+              <w:t>பய</w:t>
+            </w:r>
+            <w:r>
+              <w:rPr>
+                <w:rFonts w:ascii="BRH Tamil Tab Extra" w:hAnsi="BRH Tamil Tab Extra" w:cs="Latha"/>
+                <w:b/>
+                <w:sz w:val="36"/>
+                <w:szCs w:val="28"/>
+                <w:lang w:bidi="ta-IN"/>
+              </w:rPr>
+              <w:t>†</w:t>
+            </w:r>
+            <w:r>
+              <w:rPr>
+                <w:rFonts w:ascii="Latha" w:hAnsi="Latha" w:cs="Latha"/>
+                <w:sz w:val="28"/>
+                <w:szCs w:val="28"/>
+                <w:cs/>
+                <w:lang w:bidi="ta-IN"/>
+              </w:rPr>
+              <w:t>ஸ்வதீ</w:t>
+            </w:r>
+            <w:r>
+              <w:rPr>
+                <w:rFonts w:ascii="Latha" w:hAnsi="Latha" w:cs="Latha"/>
+                <w:sz w:val="28"/>
+                <w:szCs w:val="28"/>
+                <w:lang w:bidi="ta-IN"/>
+              </w:rPr>
+              <w:t xml:space="preserve"> </w:t>
+            </w:r>
+            <w:r>
+              <w:rPr>
+                <w:rFonts w:ascii="Latha" w:hAnsi="Latha" w:cs="Latha"/>
+                <w:sz w:val="28"/>
+                <w:szCs w:val="28"/>
+                <w:highlight w:val="green"/>
+                <w:cs/>
+                <w:lang w:bidi="ta-IN"/>
+              </w:rPr>
+              <w:t>து</w:t>
+            </w:r>
+            <w:r>
+              <w:rPr>
+                <w:rFonts w:ascii="Latha" w:hAnsi="Latha" w:cs="Latha"/>
+                <w:b/>
+                <w:bCs/>
+                <w:position w:val="-12"/>
+                <w:sz w:val="28"/>
+                <w:szCs w:val="28"/>
+                <w:highlight w:val="green"/>
+                <w:cs/>
+                <w:lang w:bidi="ta-IN"/>
+              </w:rPr>
+              <w:t>4</w:t>
+            </w:r>
+            <w:r>
+              <w:rPr>
+                <w:rFonts w:ascii="Latha" w:hAnsi="Latha" w:cs="Latha"/>
+                <w:sz w:val="28"/>
+                <w:szCs w:val="28"/>
+                <w:cs/>
+                <w:lang w:bidi="ta-IN"/>
+              </w:rPr>
+              <w:t>க்ஷ்</w:t>
+            </w:r>
+            <w:r>
+              <w:rPr>
+                <w:rFonts w:ascii="Latha" w:hAnsi="Latha" w:cs="Latha"/>
+                <w:sz w:val="28"/>
+                <w:szCs w:val="28"/>
+                <w:cs/>
+                <w:lang w:bidi="ta-IN"/>
+              </w:rPr>
+              <w:t>வ</w:t>
+            </w:r>
+            <w:r>
+              <w:rPr>
+                <w:rFonts w:ascii="Latha" w:hAnsi="Latha" w:cs="Latha"/>
+                <w:sz w:val="28"/>
+                <w:szCs w:val="28"/>
+                <w:lang w:bidi="ta-IN"/>
+              </w:rPr>
+              <w:t xml:space="preserve"> |</w:t>
+            </w:r>
+          </w:p>
+        </w:tc>
+      </w:tr>
     </w:tbl>
     <w:p>
       <w:pPr>
@@ -900,28 +1475,6 @@
           <w:u w:val="single"/>
         </w:rPr>
       </w:pPr>
-    </w:p>
-    <w:p>
-      <w:pPr>
-        <w:jc w:val="center"/>
-        <w:rPr>
-          <w:b/>
-          <w:bCs/>
-          <w:sz w:val="32"/>
-          <w:szCs w:val="32"/>
-          <w:u w:val="single"/>
-        </w:rPr>
-      </w:pPr>
-      <w:r>
-        <w:rPr>
-          <w:b/>
-          <w:bCs/>
-          <w:sz w:val="32"/>
-          <w:szCs w:val="32"/>
-          <w:u w:val="single"/>
-        </w:rPr>
-        <w:br/>
-      </w:r>
       <w:r>
         <w:rPr>
           <w:b/>
@@ -3284,54 +3837,6 @@
           <w:u w:val="single"/>
         </w:rPr>
       </w:pPr>
-    </w:p>
-    <w:p>
-      <w:pPr>
-        <w:jc w:val="center"/>
-        <w:rPr>
-          <w:b/>
-          <w:bCs/>
-          <w:sz w:val="32"/>
-          <w:szCs w:val="32"/>
-          <w:u w:val="single"/>
-        </w:rPr>
-      </w:pPr>
-    </w:p>
-    <w:p>
-      <w:pPr>
-        <w:jc w:val="center"/>
-        <w:rPr>
-          <w:b/>
-          <w:bCs/>
-          <w:sz w:val="32"/>
-          <w:szCs w:val="32"/>
-          <w:u w:val="single"/>
-        </w:rPr>
-      </w:pPr>
-    </w:p>
-    <w:p>
-      <w:pPr>
-        <w:jc w:val="center"/>
-        <w:rPr>
-          <w:b/>
-          <w:bCs/>
-          <w:sz w:val="32"/>
-          <w:szCs w:val="32"/>
-          <w:u w:val="single"/>
-        </w:rPr>
-      </w:pPr>
-    </w:p>
-    <w:p>
-      <w:pPr>
-        <w:jc w:val="center"/>
-        <w:rPr>
-          <w:b/>
-          <w:bCs/>
-          <w:sz w:val="32"/>
-          <w:szCs w:val="32"/>
-          <w:u w:val="single"/>
-        </w:rPr>
-      </w:pPr>
       <w:r>
         <w:rPr>
           <w:b/>
@@ -4609,7 +5114,6 @@
                 <w:sz w:val="28"/>
                 <w:szCs w:val="32"/>
               </w:rPr>
-              <w:lastRenderedPageBreak/>
               <w:t>T.S.</w:t>
             </w:r>
             <w:r>
@@ -5072,6 +5576,7 @@
                 <w:sz w:val="28"/>
                 <w:szCs w:val="32"/>
               </w:rPr>
+              <w:lastRenderedPageBreak/>
               <w:t>T.S.</w:t>
             </w:r>
             <w:r>
@@ -5902,266 +6407,255 @@
             <w:pPr>
               <w:spacing w:before="0" w:line="240" w:lineRule="auto"/>
               <w:rPr>
-                <w:rFonts w:ascii="Latha" w:hAnsi="Latha" w:cs="Latha"/>
-                <w:sz w:val="28"/>
-                <w:szCs w:val="28"/>
-                <w:lang w:bidi="ta-IN"/>
-              </w:rPr>
-            </w:pPr>
-            <w:r>
-              <w:rPr>
-                <w:rFonts w:ascii="Latha" w:hAnsi="Latha" w:cs="Latha"/>
-                <w:sz w:val="28"/>
-                <w:szCs w:val="28"/>
-                <w:cs/>
-                <w:lang w:bidi="ta-IN"/>
-              </w:rPr>
-              <w:t>ச</w:t>
-            </w:r>
-            <w:r>
-              <w:rPr>
-                <w:rFonts w:ascii="Latha" w:hAnsi="Latha" w:cs="Latha"/>
-                <w:b/>
-                <w:bCs/>
-                <w:position w:val="-12"/>
-                <w:sz w:val="28"/>
-                <w:szCs w:val="28"/>
-                <w:cs/>
-                <w:lang w:bidi="ta-IN"/>
-              </w:rPr>
-              <w:t>2</w:t>
-            </w:r>
-            <w:r>
-              <w:rPr>
-                <w:rFonts w:ascii="Latha" w:hAnsi="Latha" w:cs="Latha"/>
-                <w:sz w:val="28"/>
-                <w:szCs w:val="28"/>
-                <w:cs/>
-                <w:lang w:bidi="ta-IN"/>
-              </w:rPr>
-              <w:t>ந்தோ</w:t>
-            </w:r>
-            <w:r>
-              <w:rPr>
-                <w:rFonts w:ascii="BRH Tamil Tab Extra" w:hAnsi="BRH Tamil Tab Extra" w:cs="Latha"/>
-                <w:b/>
-                <w:sz w:val="36"/>
-                <w:szCs w:val="28"/>
-                <w:lang w:bidi="ta-IN"/>
-              </w:rPr>
-              <w:t>‡</w:t>
-            </w:r>
-            <w:r>
-              <w:rPr>
-                <w:rFonts w:ascii="Latha" w:hAnsi="Latha" w:cs="Latha"/>
-                <w:b/>
-                <w:bCs/>
-                <w:position w:val="-12"/>
-                <w:sz w:val="28"/>
-                <w:szCs w:val="28"/>
-                <w:cs/>
-                <w:lang w:bidi="ta-IN"/>
-              </w:rPr>
-              <w:t>3</w:t>
-            </w:r>
-            <w:r>
-              <w:rPr>
-                <w:rFonts w:ascii="BRH Devanagari Extra" w:hAnsi="BRH Devanagari Extra" w:cs="Latha"/>
-                <w:b/>
-                <w:sz w:val="36"/>
-                <w:szCs w:val="28"/>
-                <w:highlight w:val="green"/>
-                <w:lang w:bidi="ta-IN"/>
-              </w:rPr>
-              <w:t>Å</w:t>
-            </w:r>
-            <w:r>
-              <w:rPr>
-                <w:rFonts w:ascii="Latha" w:hAnsi="Latha" w:cs="Latha"/>
-                <w:sz w:val="28"/>
-                <w:szCs w:val="28"/>
-                <w:highlight w:val="green"/>
-                <w:cs/>
-                <w:lang w:bidi="ta-IN"/>
-              </w:rPr>
-              <w:t>ஸ்ரீ</w:t>
-            </w:r>
-            <w:r>
-              <w:rPr>
-                <w:rFonts w:ascii="BRH Tamil Tab Extra" w:hAnsi="BRH Tamil Tab Extra" w:cs="Latha"/>
-                <w:b/>
-                <w:sz w:val="36"/>
-                <w:szCs w:val="28"/>
-                <w:highlight w:val="green"/>
-                <w:lang w:bidi="ta-IN"/>
-              </w:rPr>
-              <w:t>…</w:t>
-            </w:r>
-            <w:r>
-              <w:rPr>
-                <w:rFonts w:ascii="Latha" w:hAnsi="Latha" w:cs="Latha"/>
-                <w:sz w:val="28"/>
-                <w:szCs w:val="28"/>
-                <w:highlight w:val="green"/>
-                <w:cs/>
-                <w:lang w:bidi="ta-IN"/>
-              </w:rPr>
-              <w:t>வி</w:t>
-            </w:r>
-            <w:r>
-              <w:rPr>
-                <w:rFonts w:ascii="Latha" w:hAnsi="Latha" w:cs="Latha"/>
-                <w:b/>
-                <w:bCs/>
-                <w:sz w:val="32"/>
-                <w:szCs w:val="32"/>
-                <w:highlight w:val="green"/>
-                <w:cs/>
-                <w:lang w:bidi="ta-IN"/>
-              </w:rPr>
-              <w:t>:</w:t>
-            </w:r>
-            <w:r>
-              <w:rPr>
-                <w:rFonts w:ascii="Latha" w:hAnsi="Latha" w:cs="Latha"/>
-                <w:sz w:val="28"/>
-                <w:szCs w:val="28"/>
-                <w:lang w:bidi="ta-IN"/>
-              </w:rPr>
-              <w:t xml:space="preserve"> | </w:t>
-            </w:r>
-            <w:r>
-              <w:rPr>
-                <w:rFonts w:ascii="Latha" w:hAnsi="Latha" w:cs="Latha"/>
-                <w:sz w:val="28"/>
-                <w:szCs w:val="28"/>
-                <w:highlight w:val="green"/>
-                <w:cs/>
-                <w:lang w:bidi="ta-IN"/>
-              </w:rPr>
-              <w:t>அ</w:t>
-            </w:r>
-            <w:r>
-              <w:rPr>
-                <w:rFonts w:ascii="BRH Tamil Tab Extra" w:hAnsi="BRH Tamil Tab Extra" w:cs="Latha"/>
-                <w:b/>
-                <w:sz w:val="36"/>
-                <w:szCs w:val="28"/>
-                <w:highlight w:val="green"/>
-                <w:lang w:bidi="ta-IN"/>
-              </w:rPr>
-              <w:t>…</w:t>
-            </w:r>
-            <w:r>
-              <w:rPr>
-                <w:rFonts w:ascii="Latha" w:hAnsi="Latha" w:cs="Latha"/>
-                <w:sz w:val="28"/>
-                <w:szCs w:val="28"/>
-                <w:highlight w:val="green"/>
-                <w:cs/>
-                <w:lang w:bidi="ta-IN"/>
-              </w:rPr>
-              <w:t>ஸ்ரீ</w:t>
-            </w:r>
-            <w:r>
-              <w:rPr>
-                <w:rFonts w:ascii="BRH Tamil Tab Extra" w:hAnsi="BRH Tamil Tab Extra" w:cs="Latha"/>
-                <w:b/>
-                <w:sz w:val="36"/>
-                <w:szCs w:val="28"/>
-                <w:highlight w:val="green"/>
-                <w:lang w:bidi="ta-IN"/>
-              </w:rPr>
-              <w:t>…</w:t>
-            </w:r>
-            <w:r>
-              <w:rPr>
-                <w:rFonts w:ascii="Latha" w:hAnsi="Latha" w:cs="Latha"/>
-                <w:sz w:val="28"/>
-                <w:szCs w:val="28"/>
-                <w:cs/>
-                <w:lang w:bidi="ta-IN"/>
-              </w:rPr>
-              <w:t>விஶ்ச</w:t>
-            </w:r>
-            <w:r>
-              <w:rPr>
-                <w:rFonts w:ascii="Latha" w:hAnsi="Latha" w:cs="Latha"/>
-                <w:b/>
-                <w:bCs/>
-                <w:position w:val="-12"/>
-                <w:sz w:val="28"/>
-                <w:szCs w:val="28"/>
-                <w:cs/>
-                <w:lang w:bidi="ta-IN"/>
-              </w:rPr>
-              <w:t>2</w:t>
-            </w:r>
-            <w:r>
-              <w:rPr>
-                <w:rFonts w:ascii="Latha" w:hAnsi="Latha" w:cs="Latha"/>
-                <w:sz w:val="28"/>
-                <w:szCs w:val="28"/>
-                <w:cs/>
-                <w:lang w:bidi="ta-IN"/>
-              </w:rPr>
-              <w:t>ந்த</w:t>
-            </w:r>
-            <w:r>
-              <w:rPr>
-                <w:rFonts w:ascii="BRH Tamil Tab Extra" w:hAnsi="BRH Tamil Tab Extra" w:cs="Latha"/>
-                <w:b/>
-                <w:sz w:val="36"/>
-                <w:szCs w:val="28"/>
-                <w:lang w:bidi="ta-IN"/>
-              </w:rPr>
-              <w:t>†</w:t>
-            </w:r>
-            <w:r>
-              <w:rPr>
-                <w:rFonts w:ascii="Latha" w:hAnsi="Latha" w:cs="Latha"/>
-                <w:b/>
-                <w:bCs/>
-                <w:position w:val="-12"/>
-                <w:sz w:val="28"/>
-                <w:szCs w:val="28"/>
-                <w:cs/>
-                <w:lang w:bidi="ta-IN"/>
-              </w:rPr>
-              <w:t>3</w:t>
-            </w:r>
-            <w:r>
-              <w:rPr>
-                <w:rFonts w:ascii="Latha" w:hAnsi="Latha" w:cs="Latha"/>
-                <w:b/>
-                <w:bCs/>
-                <w:sz w:val="32"/>
-                <w:szCs w:val="32"/>
-                <w:cs/>
-                <w:lang w:bidi="ta-IN"/>
-              </w:rPr>
-              <w:t>:</w:t>
-            </w:r>
-            <w:r>
-              <w:rPr>
-                <w:rFonts w:ascii="Latha" w:hAnsi="Latha" w:cs="Latha"/>
-                <w:sz w:val="28"/>
-                <w:szCs w:val="28"/>
-                <w:lang w:bidi="ta-IN"/>
-              </w:rPr>
-              <w:t xml:space="preserve"> |</w:t>
-            </w:r>
-          </w:p>
-          <w:p>
-            <w:pPr>
-              <w:spacing w:before="0" w:line="240" w:lineRule="auto"/>
-              <w:rPr>
                 <w:rFonts w:ascii="BRH Devanagari Extra" w:hAnsi="BRH Devanagari Extra" w:cs="BRH Devanagari Extra"/>
                 <w:color w:val="000000"/>
                 <w:sz w:val="40"/>
                 <w:szCs w:val="40"/>
               </w:rPr>
             </w:pPr>
+            <w:r>
+              <w:rPr>
+                <w:rFonts w:ascii="Latha" w:hAnsi="Latha" w:cs="Latha"/>
+                <w:sz w:val="28"/>
+                <w:szCs w:val="28"/>
+                <w:cs/>
+                <w:lang w:bidi="ta-IN"/>
+              </w:rPr>
+              <w:t>ச</w:t>
+            </w:r>
+            <w:r>
+              <w:rPr>
+                <w:rFonts w:ascii="Latha" w:hAnsi="Latha" w:cs="Latha"/>
+                <w:b/>
+                <w:bCs/>
+                <w:position w:val="-12"/>
+                <w:sz w:val="28"/>
+                <w:szCs w:val="28"/>
+                <w:cs/>
+                <w:lang w:bidi="ta-IN"/>
+              </w:rPr>
+              <w:t>2</w:t>
+            </w:r>
+            <w:r>
+              <w:rPr>
+                <w:rFonts w:ascii="Latha" w:hAnsi="Latha" w:cs="Latha"/>
+                <w:sz w:val="28"/>
+                <w:szCs w:val="28"/>
+                <w:cs/>
+                <w:lang w:bidi="ta-IN"/>
+              </w:rPr>
+              <w:t>ந்தோ</w:t>
+            </w:r>
+            <w:r>
+              <w:rPr>
+                <w:rFonts w:ascii="BRH Tamil Tab Extra" w:hAnsi="BRH Tamil Tab Extra" w:cs="Latha"/>
+                <w:b/>
+                <w:sz w:val="36"/>
+                <w:szCs w:val="28"/>
+                <w:lang w:bidi="ta-IN"/>
+              </w:rPr>
+              <w:t>‡</w:t>
+            </w:r>
+            <w:r>
+              <w:rPr>
+                <w:rFonts w:ascii="Latha" w:hAnsi="Latha" w:cs="Latha"/>
+                <w:b/>
+                <w:bCs/>
+                <w:position w:val="-12"/>
+                <w:sz w:val="28"/>
+                <w:szCs w:val="28"/>
+                <w:cs/>
+                <w:lang w:bidi="ta-IN"/>
+              </w:rPr>
+              <w:t>3</w:t>
+            </w:r>
+            <w:r>
+              <w:rPr>
+                <w:rFonts w:ascii="BRH Devanagari Extra" w:hAnsi="BRH Devanagari Extra" w:cs="Latha"/>
+                <w:b/>
+                <w:sz w:val="36"/>
+                <w:szCs w:val="28"/>
+                <w:highlight w:val="green"/>
+                <w:lang w:bidi="ta-IN"/>
+              </w:rPr>
+              <w:t>Å</w:t>
+            </w:r>
+            <w:r>
+              <w:rPr>
+                <w:rFonts w:ascii="Latha" w:hAnsi="Latha" w:cs="Latha"/>
+                <w:sz w:val="28"/>
+                <w:szCs w:val="28"/>
+                <w:highlight w:val="green"/>
+                <w:cs/>
+                <w:lang w:bidi="ta-IN"/>
+              </w:rPr>
+              <w:t>ஸ்ரீ</w:t>
+            </w:r>
+            <w:r>
+              <w:rPr>
+                <w:rFonts w:ascii="BRH Tamil Tab Extra" w:hAnsi="BRH Tamil Tab Extra" w:cs="Latha"/>
+                <w:b/>
+                <w:sz w:val="36"/>
+                <w:szCs w:val="28"/>
+                <w:highlight w:val="green"/>
+                <w:lang w:bidi="ta-IN"/>
+              </w:rPr>
+              <w:t>…</w:t>
+            </w:r>
+            <w:r>
+              <w:rPr>
+                <w:rFonts w:ascii="Latha" w:hAnsi="Latha" w:cs="Latha"/>
+                <w:sz w:val="28"/>
+                <w:szCs w:val="28"/>
+                <w:highlight w:val="green"/>
+                <w:cs/>
+                <w:lang w:bidi="ta-IN"/>
+              </w:rPr>
+              <w:t>வி</w:t>
+            </w:r>
+            <w:r>
+              <w:rPr>
+                <w:rFonts w:ascii="Latha" w:hAnsi="Latha" w:cs="Latha"/>
+                <w:b/>
+                <w:bCs/>
+                <w:sz w:val="32"/>
+                <w:szCs w:val="32"/>
+                <w:highlight w:val="green"/>
+                <w:cs/>
+                <w:lang w:bidi="ta-IN"/>
+              </w:rPr>
+              <w:t>:</w:t>
+            </w:r>
+            <w:r>
+              <w:rPr>
+                <w:rFonts w:ascii="Latha" w:hAnsi="Latha" w:cs="Latha"/>
+                <w:sz w:val="28"/>
+                <w:szCs w:val="28"/>
+                <w:lang w:bidi="ta-IN"/>
+              </w:rPr>
+              <w:t xml:space="preserve"> | </w:t>
+            </w:r>
+            <w:r>
+              <w:rPr>
+                <w:rFonts w:ascii="Latha" w:hAnsi="Latha" w:cs="Latha"/>
+                <w:sz w:val="28"/>
+                <w:szCs w:val="28"/>
+                <w:highlight w:val="green"/>
+                <w:cs/>
+                <w:lang w:bidi="ta-IN"/>
+              </w:rPr>
+              <w:t>அ</w:t>
+            </w:r>
+            <w:r>
+              <w:rPr>
+                <w:rFonts w:ascii="BRH Tamil Tab Extra" w:hAnsi="BRH Tamil Tab Extra" w:cs="Latha"/>
+                <w:b/>
+                <w:sz w:val="36"/>
+                <w:szCs w:val="28"/>
+                <w:highlight w:val="green"/>
+                <w:lang w:bidi="ta-IN"/>
+              </w:rPr>
+              <w:t>…</w:t>
+            </w:r>
+            <w:r>
+              <w:rPr>
+                <w:rFonts w:ascii="Latha" w:hAnsi="Latha" w:cs="Latha"/>
+                <w:sz w:val="28"/>
+                <w:szCs w:val="28"/>
+                <w:highlight w:val="green"/>
+                <w:cs/>
+                <w:lang w:bidi="ta-IN"/>
+              </w:rPr>
+              <w:t>ஸ்ரீ</w:t>
+            </w:r>
+            <w:r>
+              <w:rPr>
+                <w:rFonts w:ascii="BRH Tamil Tab Extra" w:hAnsi="BRH Tamil Tab Extra" w:cs="Latha"/>
+                <w:b/>
+                <w:sz w:val="36"/>
+                <w:szCs w:val="28"/>
+                <w:highlight w:val="green"/>
+                <w:lang w:bidi="ta-IN"/>
+              </w:rPr>
+              <w:t>…</w:t>
+            </w:r>
+            <w:r>
+              <w:rPr>
+                <w:rFonts w:ascii="Latha" w:hAnsi="Latha" w:cs="Latha"/>
+                <w:sz w:val="28"/>
+                <w:szCs w:val="28"/>
+                <w:cs/>
+                <w:lang w:bidi="ta-IN"/>
+              </w:rPr>
+              <w:t>விஶ்ச</w:t>
+            </w:r>
+            <w:r>
+              <w:rPr>
+                <w:rFonts w:ascii="Latha" w:hAnsi="Latha" w:cs="Latha"/>
+                <w:b/>
+                <w:bCs/>
+                <w:position w:val="-12"/>
+                <w:sz w:val="28"/>
+                <w:szCs w:val="28"/>
+                <w:cs/>
+                <w:lang w:bidi="ta-IN"/>
+              </w:rPr>
+              <w:t>2</w:t>
+            </w:r>
+            <w:r>
+              <w:rPr>
+                <w:rFonts w:ascii="Latha" w:hAnsi="Latha" w:cs="Latha"/>
+                <w:sz w:val="28"/>
+                <w:szCs w:val="28"/>
+                <w:cs/>
+                <w:lang w:bidi="ta-IN"/>
+              </w:rPr>
+              <w:t>ந்த</w:t>
+            </w:r>
+            <w:r>
+              <w:rPr>
+                <w:rFonts w:ascii="BRH Tamil Tab Extra" w:hAnsi="BRH Tamil Tab Extra" w:cs="Latha"/>
+                <w:b/>
+                <w:sz w:val="36"/>
+                <w:szCs w:val="28"/>
+                <w:lang w:bidi="ta-IN"/>
+              </w:rPr>
+              <w:t>†</w:t>
+            </w:r>
+            <w:r>
+              <w:rPr>
+                <w:rFonts w:ascii="Latha" w:hAnsi="Latha" w:cs="Latha"/>
+                <w:b/>
+                <w:bCs/>
+                <w:position w:val="-12"/>
+                <w:sz w:val="28"/>
+                <w:szCs w:val="28"/>
+                <w:cs/>
+                <w:lang w:bidi="ta-IN"/>
+              </w:rPr>
+              <w:t>3</w:t>
+            </w:r>
+            <w:r>
+              <w:rPr>
+                <w:rFonts w:ascii="Latha" w:hAnsi="Latha" w:cs="Latha"/>
+                <w:b/>
+                <w:bCs/>
+                <w:sz w:val="32"/>
+                <w:szCs w:val="32"/>
+                <w:cs/>
+                <w:lang w:bidi="ta-IN"/>
+              </w:rPr>
+              <w:t>:</w:t>
+            </w:r>
+            <w:r>
+              <w:rPr>
+                <w:rFonts w:ascii="Latha" w:hAnsi="Latha" w:cs="Latha"/>
+                <w:sz w:val="28"/>
+                <w:szCs w:val="28"/>
+                <w:lang w:bidi="ta-IN"/>
+              </w:rPr>
+              <w:t xml:space="preserve"> |</w:t>
+            </w:r>
           </w:p>
         </w:tc>
       </w:tr>
@@ -8789,7 +9283,6 @@
                 <w:sz w:val="28"/>
                 <w:szCs w:val="32"/>
               </w:rPr>
-              <w:lastRenderedPageBreak/>
               <w:t>T.S.4.3.10.1 – Kramam</w:t>
             </w:r>
           </w:p>
@@ -9268,6 +9761,7 @@
                 <w:sz w:val="28"/>
                 <w:szCs w:val="32"/>
               </w:rPr>
+              <w:lastRenderedPageBreak/>
               <w:t>T.S.4.3.10.1 – Kramam</w:t>
             </w:r>
           </w:p>
@@ -12966,7 +13460,6 @@
                 <w:sz w:val="28"/>
                 <w:szCs w:val="32"/>
               </w:rPr>
-              <w:lastRenderedPageBreak/>
               <w:t>T.S.4.3.13.12 – Kramam</w:t>
             </w:r>
           </w:p>
@@ -13520,6 +14013,7 @@
                 <w:sz w:val="28"/>
                 <w:szCs w:val="32"/>
               </w:rPr>
+              <w:lastRenderedPageBreak/>
               <w:t>T.S.4.3.13.4 – Kramam</w:t>
             </w:r>
           </w:p>
@@ -16654,6 +17148,9 @@
     </w:p>
     <w:p>
       <w:pPr>
+        <w:pBdr>
+          <w:bottom w:val="double" w:sz="6" w:space="1" w:color="auto"/>
+        </w:pBdr>
         <w:jc w:val="center"/>
         <w:rPr>
           <w:b/>
@@ -16663,7 +17160,10 @@
           <w:u w:val="single"/>
         </w:rPr>
       </w:pPr>
-      <w:r>
+    </w:p>
+    <w:p>
+      <w:pPr>
+        <w:jc w:val="center"/>
         <w:rPr>
           <w:b/>
           <w:bCs/>
@@ -16671,8 +17171,31 @@
           <w:szCs w:val="32"/>
           <w:u w:val="single"/>
         </w:rPr>
-        <w:t>=========================</w:t>
-      </w:r>
+      </w:pPr>
+    </w:p>
+    <w:p>
+      <w:pPr>
+        <w:jc w:val="center"/>
+        <w:rPr>
+          <w:b/>
+          <w:bCs/>
+          <w:sz w:val="32"/>
+          <w:szCs w:val="32"/>
+          <w:u w:val="single"/>
+        </w:rPr>
+      </w:pPr>
+    </w:p>
+    <w:p>
+      <w:pPr>
+        <w:jc w:val="center"/>
+        <w:rPr>
+          <w:b/>
+          <w:bCs/>
+          <w:sz w:val="32"/>
+          <w:szCs w:val="32"/>
+          <w:u w:val="single"/>
+        </w:rPr>
+      </w:pPr>
     </w:p>
     <w:p>
       <w:pPr>
@@ -16693,6 +17216,7 @@
           <w:szCs w:val="32"/>
           <w:u w:val="single"/>
         </w:rPr>
+        <w:lastRenderedPageBreak/>
         <w:t xml:space="preserve">TS </w:t>
       </w:r>
       <w:r>
@@ -16830,7 +17354,6 @@
           <w:b/>
           <w:bCs/>
         </w:rPr>
-        <w:lastRenderedPageBreak/>
         <w:t>(ignore those which are already incorporated in your book’s version and date)</w:t>
       </w:r>
     </w:p>

</xml_diff>